<commit_message>
Update CV: frame building, tour mechanic role, Ability Made, remove Amend Rehab
Co-Authored-By: Claude Opus 5.5 <noreply@anthropic.com>
Claude-Session: https://claude.ai/code/session_01JjcP4xCcm7Up9wE3QBRZN1
</commit_message>
<xml_diff>
--- a/Robert_Heideman_CV_Bicycle_Technician.docx
+++ b/Robert_Heideman_CV_Bicycle_Technician.docx
@@ -65,7 +65,7 @@
         <w:rPr>
           <w:i w:val="0"/>
         </w:rPr>
-        <w:t>Bicycle mechanic with 10 years of hands-on experience, including running my own repair business, Heiden Cycle Works, since 2020 and working as a mechanic with Wide Open Road Cycling since 2016. I love bikes and the people who ride them. I also love teaching people how to fix them. Alongside the bikes, I have a ten-year career as a Prosthetist-Orthotist, where I've run workshops, built a new department from scratch and mentored junior technicians. Every day in that job means explaining technical things in plain, encouraging language. I'm keen to bring my mechanical skills, workshop experience and passion for sharing knowledge to the PUSH! team and help young people build bikes, skills and confidence.</w:t>
+        <w:t>Frame builder and bicycle mechanic with 10 years of hands-on experience. I founded Heiden Cycle Works in 2020, where I design and build my own frames and service bikes of every kind. Since 2016 I've also been a travelling tour mechanic with Wide Open Road Cycling. I love bikes and the people who ride them. I also love teaching people how to fix them. Alongside the bikes, I have a ten-year career as a Prosthetist-Orthotist, where I've run workshops, fabricated devices by hand and mentored junior technicians. Every day in that job means explaining technical things in plain, encouraging language. I'm keen to bring my building and mechanical skills, workshop experience and passion for sharing knowledge to the PUSH! team and help young people build bikes, skills and confidence.</w:t>
       </w:r>
     </w:p>
     <w:p>
@@ -98,7 +98,7 @@
         <w:t>Bicycle mechanics:</w:t>
       </w:r>
       <w:r>
-        <w:t xml:space="preserve"> full servicing, diagnosis and repair of road, mountain, hybrid, kids' and e-bikes; complete bike builds from frame up; brakes, gears, drivetrains, wheels, hubs and bearings.</w:t>
+        <w:t xml:space="preserve"> full servicing, diagnosis and repair of road, mountain, hybrid, kids' and e-bikes; complete bike builds from the frame up, including custom frame building; brakes, gears, drivetrains, wheels, hubs and bearings.</w:t>
       </w:r>
     </w:p>
     <w:p>
@@ -130,7 +130,7 @@
         <w:t>Workshop management:</w:t>
       </w:r>
       <w:r>
-        <w:t xml:space="preserve"> setting up and running workshops, including tool and equipment upkeep, parts inventory and ordering, workflow and workplace safety.</w:t>
+        <w:t xml:space="preserve"> running workshops, including tool and equipment upkeep, parts inventory and ordering, workflow and workplace safety.</w:t>
       </w:r>
     </w:p>
     <w:p>
@@ -178,7 +178,7 @@
         <w:t>Making and fabrication:</w:t>
       </w:r>
       <w:r>
-        <w:t xml:space="preserve"> design, fabrication and problem-solving, including Fusion 360 CAD and 3D printing (FDM, SLA, SLS). I love inventing, building and improving things.</w:t>
+        <w:t xml:space="preserve"> carbon frame building, design and problem-solving, including Fusion 360 CAD and 3D printing (FDM, SLA, SLS). I love inventing, building and improving things.</w:t>
       </w:r>
     </w:p>
     <w:p>
@@ -210,7 +210,7 @@
         <w:rPr>
           <w:b/>
         </w:rPr>
-        <w:t>Owner / Bicycle Technician</w:t>
+        <w:t>Founder / Frame Builder and Bicycle Technician</w:t>
       </w:r>
       <w:r>
         <w:rPr>
@@ -241,7 +241,7 @@
         <w:ind w:left="340"/>
       </w:pPr>
       <w:r>
-        <w:t>Run my own bike servicing and repair business, covering everything from quick fixes to full overhauls and custom builds.</w:t>
+        <w:t>Founded the business. I design and build custom bicycle frames from carbon tubes joined with 3D-printed lugs, which I design myself.</w:t>
       </w:r>
     </w:p>
     <w:p>
@@ -251,7 +251,7 @@
         <w:ind w:left="340"/>
       </w:pPr>
       <w:r>
-        <w:t>Diagnose faults, quote the work and complete repairs to a high safety standard on a wide range of bikes.</w:t>
+        <w:t>Build, service and repair all kinds of bikes, from entry-level commuters to high-end race bikes.</w:t>
       </w:r>
     </w:p>
     <w:p>
@@ -261,7 +261,7 @@
         <w:ind w:left="340"/>
       </w:pPr>
       <w:r>
-        <w:t>Manage every part of the business: customer service, bookings, sourcing and ordering parts, tool upkeep and accounts.</w:t>
+        <w:t>Diagnose faults, quote the work and complete repairs to a high safety standard.</w:t>
       </w:r>
     </w:p>
     <w:p>
@@ -271,7 +271,7 @@
         <w:ind w:left="340"/>
       </w:pPr>
       <w:r>
-        <w:t>Explain repairs to customers and show them simple maintenance they can do themselves.</w:t>
+        <w:t>Run every part of the business, including customer service, sourcing and ordering parts, workshop and tool upkeep, and accounts.</w:t>
       </w:r>
     </w:p>
     <w:p>
@@ -286,7 +286,7 @@
         <w:rPr>
           <w:b/>
         </w:rPr>
-        <w:t>Bicycle Mechanic</w:t>
+        <w:t>Travelling Tour Mechanic</w:t>
       </w:r>
       <w:r>
         <w:rPr>
@@ -294,7 +294,7 @@
           <w:sz w:val="20"/>
         </w:rPr>
         <w:tab/>
-        <w:t>2016 – Present</w:t>
+        <w:t>2016 – Present (tours each year)</w:t>
       </w:r>
     </w:p>
     <w:p>
@@ -317,7 +317,7 @@
         <w:ind w:left="340"/>
       </w:pPr>
       <w:r>
-        <w:t>Mechanic supporting riders, including bike preparation, pre-ride safety checks and on-the-spot repairs.</w:t>
+        <w:t>Travel with the group on multi-day cycling tours each year and maintain every bike on the tour.</w:t>
       </w:r>
     </w:p>
     <w:p>
@@ -327,7 +327,7 @@
         <w:ind w:left="340"/>
       </w:pPr>
       <w:r>
-        <w:t>Fix mechanical problems quickly and calmly, often on the road with a mobile tool kit.</w:t>
+        <w:t>Do daily safety checks, servicing and roadside repairs from a mobile workshop, often with limited tools and parts.</w:t>
       </w:r>
     </w:p>
     <w:p>
@@ -471,6 +471,52 @@
         <w:rPr>
           <w:b/>
         </w:rPr>
+        <w:t>Senior Orthotist</w:t>
+      </w:r>
+      <w:r>
+        <w:rPr>
+          <w:color w:val="555555"/>
+          <w:sz w:val="20"/>
+        </w:rPr>
+        <w:tab/>
+        <w:t>Jan 2026 – Sep 2026</w:t>
+      </w:r>
+    </w:p>
+    <w:p>
+      <w:pPr>
+        <w:keepNext/>
+        <w:spacing w:after="40"/>
+      </w:pPr>
+      <w:r>
+        <w:rPr>
+          <w:i/>
+          <w:color w:val="555555"/>
+        </w:rPr>
+        <w:t>Ability Made</w:t>
+      </w:r>
+    </w:p>
+    <w:p>
+      <w:pPr>
+        <w:pStyle w:val="ListBullet"/>
+        <w:spacing w:after="20"/>
+        <w:ind w:left="340"/>
+      </w:pPr>
+      <w:r>
+        <w:t>Senior orthotic role delivering custom orthoses made with digital scanning and design.</w:t>
+      </w:r>
+    </w:p>
+    <w:p>
+      <w:pPr>
+        <w:keepNext/>
+        <w:tabs>
+          <w:tab w:pos="9751" w:val="right"/>
+        </w:tabs>
+        <w:spacing w:before="100" w:after="0"/>
+      </w:pPr>
+      <w:r>
+        <w:rPr>
+          <w:b/>
+        </w:rPr>
         <w:t>Senior Prosthetist/Orthotist</w:t>
       </w:r>
       <w:r>
@@ -479,7 +525,7 @@
           <w:sz w:val="20"/>
         </w:rPr>
         <w:tab/>
-        <w:t>May 2025 – Present</w:t>
+        <w:t>May 2025 – Mar 2026</w:t>
       </w:r>
     </w:p>
     <w:p>
@@ -503,62 +549,6 @@
       </w:pPr>
       <w:r>
         <w:t>Manage complex inpatient and outpatient cases as part of a multidisciplinary team, and lead quality assurance projects.</w:t>
-      </w:r>
-    </w:p>
-    <w:p>
-      <w:pPr>
-        <w:keepNext/>
-        <w:tabs>
-          <w:tab w:pos="9751" w:val="right"/>
-        </w:tabs>
-        <w:spacing w:before="100" w:after="0"/>
-      </w:pPr>
-      <w:r>
-        <w:rPr>
-          <w:b/>
-        </w:rPr>
-        <w:t>Senior Prosthetist/Orthotist</w:t>
-      </w:r>
-      <w:r>
-        <w:rPr>
-          <w:color w:val="555555"/>
-          <w:sz w:val="20"/>
-        </w:rPr>
-        <w:tab/>
-        <w:t>Apr 2024 – Present</w:t>
-      </w:r>
-    </w:p>
-    <w:p>
-      <w:pPr>
-        <w:keepNext/>
-        <w:spacing w:after="40"/>
-      </w:pPr>
-      <w:r>
-        <w:rPr>
-          <w:i/>
-          <w:color w:val="555555"/>
-        </w:rPr>
-        <w:t>Amend Rehab Pty Ltd, Eight Mile Plains QLD</w:t>
-      </w:r>
-    </w:p>
-    <w:p>
-      <w:pPr>
-        <w:pStyle w:val="ListBullet"/>
-        <w:spacing w:after="20"/>
-        <w:ind w:left="340"/>
-      </w:pPr>
-      <w:r>
-        <w:t>Set up a new Prosthetics and Orthotics department from scratch, including the workshop, equipment, workflow and digital (CAD/CAM) manufacturing.</w:t>
-      </w:r>
-    </w:p>
-    <w:p>
-      <w:pPr>
-        <w:pStyle w:val="ListBullet"/>
-        <w:spacing w:after="20"/>
-        <w:ind w:left="340"/>
-      </w:pPr>
-      <w:r>
-        <w:t>Responsible for assessment, manufacturing, fitting, referrals, NDIS funding and client relationships.</w:t>
       </w:r>
     </w:p>
     <w:p>

</xml_diff>

<commit_message>
Add current Blue Card and Yellow Card to CV
Co-Authored-By: Claude Opus 5.5 <noreply@anthropic.com>
Claude-Session: https://claude.ai/code/session_01JjcP4xCcm7Up9wE3QBRZN1
</commit_message>
<xml_diff>
--- a/Robert_Heideman_CV_Bicycle_Technician.docx
+++ b/Robert_Heideman_CV_Bicycle_Technician.docx
@@ -37,7 +37,7 @@
         <w:rPr>
           <w:sz w:val="20"/>
         </w:rPr>
-        <w:t>Wishart QLD 4122  •  0402 496 428  •  robert@heideman.com.au  •  Current Australian driver licence</w:t>
+        <w:t>Wishart QLD 4122  •  0402 496 428  •  robert@heideman.com.au  •  Driver licence  •  Current Blue Card</w:t>
       </w:r>
     </w:p>
     <w:p>
@@ -940,10 +940,10 @@
         <w:rPr>
           <w:b/>
         </w:rPr>
-        <w:t>Working with Children:</w:t>
+        <w:t>Screening checks:</w:t>
       </w:r>
       <w:r>
-        <w:t xml:space="preserve"> willing to obtain a Queensland Blue Card (Working with Children Check) straight away.</w:t>
+        <w:t xml:space="preserve"> current Queensland Blue Card (held a Working with Children Check for 10+ years) and current NDIS Worker Screening Check (Yellow Card).</w:t>
       </w:r>
     </w:p>
     <w:p>

</xml_diff>

<commit_message>
Add The Ride Cycles (2009-2015) and update years of experience
Co-Authored-By: Claude Opus 5.5 <noreply@anthropic.com>
Claude-Session: https://claude.ai/code/session_01JjcP4xCcm7Up9wE3QBRZN1
</commit_message>
<xml_diff>
--- a/Robert_Heideman_CV_Bicycle_Technician.docx
+++ b/Robert_Heideman_CV_Bicycle_Technician.docx
@@ -65,7 +65,7 @@
         <w:rPr>
           <w:i w:val="0"/>
         </w:rPr>
-        <w:t>Frame builder and bicycle mechanic with 10 years of hands-on experience. I founded Heiden Cycle Works in 2020, where I design and build my own frames and service bikes of every kind. Since 2016 I've also been a travelling tour mechanic with Wide Open Road Cycling. I love bikes and the people who ride them. I also love teaching people how to fix them. Alongside the bikes, I have a ten-year career as a Prosthetist-Orthotist, where I've run workshops, fabricated devices by hand and mentored junior technicians. Every day in that job means explaining technical things in plain, encouraging language. I'm keen to bring my building and mechanical skills, workshop experience and passion for sharing knowledge to the PUSH! team and help young people build bikes, skills and confidence.</w:t>
+        <w:t>Frame builder and bicycle mechanic with more than 15 years of hands-on experience, starting in a Melbourne bike shop in 2009. I founded Heiden Cycle Works in 2020, where I design and build my own frames and service bikes of every kind. Since 2016 I've also been a travelling tour mechanic with Wide Open Road Cycling. I love bikes and the people who ride them. I also love teaching people how to fix them. Alongside the bikes, I have a ten-year career as a Prosthetist-Orthotist, where I've run workshops, fabricated devices by hand and mentored junior technicians. Every day in that job means explaining technical things in plain, encouraging language. I'm keen to bring my building and mechanical skills, workshop experience and passion for sharing knowledge to the PUSH! team and help young people build bikes, skills and confidence.</w:t>
       </w:r>
     </w:p>
     <w:p>
@@ -352,6 +352,52 @@
         <w:rPr>
           <w:b/>
         </w:rPr>
+        <w:t>Bicycle Mechanic</w:t>
+      </w:r>
+      <w:r>
+        <w:rPr>
+          <w:color w:val="555555"/>
+          <w:sz w:val="20"/>
+        </w:rPr>
+        <w:tab/>
+        <w:t>2009 – 2015</w:t>
+      </w:r>
+    </w:p>
+    <w:p>
+      <w:pPr>
+        <w:keepNext/>
+        <w:spacing w:after="40"/>
+      </w:pPr>
+      <w:r>
+        <w:rPr>
+          <w:i/>
+          <w:color w:val="555555"/>
+        </w:rPr>
+        <w:t>The Ride Cycles, Kew VIC</w:t>
+      </w:r>
+    </w:p>
+    <w:p>
+      <w:pPr>
+        <w:pStyle w:val="ListBullet"/>
+        <w:spacing w:after="20"/>
+        <w:ind w:left="340"/>
+      </w:pPr>
+      <w:r>
+        <w:t>Workshop mechanic in a busy retail bike shop: servicing, repairs, new bike builds and customer service.</w:t>
+      </w:r>
+    </w:p>
+    <w:p>
+      <w:pPr>
+        <w:keepNext/>
+        <w:tabs>
+          <w:tab w:pos="9751" w:val="right"/>
+        </w:tabs>
+        <w:spacing w:before="100" w:after="0"/>
+      </w:pPr>
+      <w:r>
+        <w:rPr>
+          <w:b/>
+        </w:rPr>
         <w:t>Volunteer Mechanic – Great Victorian Bike Ride</w:t>
       </w:r>
       <w:r>
@@ -456,7 +502,7 @@
         <w:rPr>
           <w:i/>
         </w:rPr>
-        <w:t>Ten years as a Clinical Prosthetist-Orthotist and technician in Australia, Sweden and Norway, designing, building and fitting custom devices by hand in hands-on workshop settings.</w:t>
+        <w:t>Ten years as a Prosthetist-Orthotist and technician in Australia, Sweden and Norway, building custom devices by hand.</w:t>
       </w:r>
     </w:p>
     <w:p>
@@ -1083,7 +1129,7 @@
     </w:tbl>
     <w:sectPr>
       <w:pgSz w:w="12240" w:h="15840"/>
-      <w:pgMar w:top="737" w:right="1077" w:bottom="737" w:left="1077" w:header="720" w:footer="720" w:gutter="0"/>
+      <w:pgMar w:top="624" w:right="1077" w:bottom="624" w:left="1077" w:header="720" w:footer="720" w:gutter="0"/>
       <w:cols w:space="720"/>
       <w:docGrid w:linePitch="360"/>
     </w:sectPr>

</xml_diff>

<commit_message>
Move Cambodia to volunteering; name Lesa Ashford record attempt (2023)
Co-Authored-By: Claude Opus 5.5 <noreply@anthropic.com>
Claude-Session: https://claude.ai/code/session_01JjcP4xCcm7Up9wE3QBRZN1
</commit_message>
<xml_diff>
--- a/Robert_Heideman_CV_Bicycle_Technician.docx
+++ b/Robert_Heideman_CV_Bicycle_Technician.docx
@@ -454,7 +454,7 @@
         <w:rPr>
           <w:b/>
         </w:rPr>
-        <w:t>Volunteer Mechanic and Support Crew</w:t>
+        <w:t>Volunteer Mechanic and Support Crew – Lesa Ashford</w:t>
       </w:r>
       <w:r>
         <w:rPr>
@@ -462,6 +462,7 @@
           <w:sz w:val="20"/>
         </w:rPr>
         <w:tab/>
+        <w:t>2023</w:t>
       </w:r>
     </w:p>
     <w:p>
@@ -764,52 +765,6 @@
     <w:p>
       <w:pPr>
         <w:keepNext/>
-        <w:tabs>
-          <w:tab w:pos="9751" w:val="right"/>
-        </w:tabs>
-        <w:spacing w:before="100" w:after="0"/>
-      </w:pPr>
-      <w:r>
-        <w:rPr>
-          <w:b/>
-        </w:rPr>
-        <w:t>Clinical Placement – Prosthetics</w:t>
-      </w:r>
-      <w:r>
-        <w:rPr>
-          <w:color w:val="555555"/>
-          <w:sz w:val="20"/>
-        </w:rPr>
-        <w:tab/>
-        <w:t>Feb 2015 – Apr 2015</w:t>
-      </w:r>
-    </w:p>
-    <w:p>
-      <w:pPr>
-        <w:keepNext/>
-        <w:spacing w:after="40"/>
-      </w:pPr>
-      <w:r>
-        <w:rPr>
-          <w:i/>
-          <w:color w:val="555555"/>
-        </w:rPr>
-        <w:t>Veterans International Cambodia, Phnom Penh</w:t>
-      </w:r>
-    </w:p>
-    <w:p>
-      <w:pPr>
-        <w:pStyle w:val="ListBullet"/>
-        <w:spacing w:after="20"/>
-        <w:ind w:left="340"/>
-      </w:pPr>
-      <w:r>
-        <w:t>Built and fitted low-cost prostheses with limited resources, finding practical solutions with whatever was available.</w:t>
-      </w:r>
-    </w:p>
-    <w:p>
-      <w:pPr>
-        <w:keepNext/>
         <w:spacing w:before="160" w:after="80"/>
         <w:pBdr>
           <w:bottom w:val="single" w:sz="6" w:space="1" w:color="1F5F8B"/>
@@ -927,6 +882,16 @@
           <w:sz w:val="23"/>
         </w:rPr>
         <w:t>COMMUNITY AND VOLUNTEERING</w:t>
+      </w:r>
+    </w:p>
+    <w:p>
+      <w:pPr>
+        <w:pStyle w:val="ListBullet"/>
+        <w:spacing w:after="20"/>
+        <w:ind w:left="340"/>
+      </w:pPr>
+      <w:r>
+        <w:t>Veterans International Cambodia, Phnom Penh (2015): volunteered building and fitting low-cost prostheses with limited resources.</w:t>
       </w:r>
     </w:p>
     <w:p>

</xml_diff>

<commit_message>
Replace Amend Rehab reference with Clare Holdsworth (WOR Cycle Tours)
Co-Authored-By: Claude Opus 5.5 <noreply@anthropic.com>
Claude-Session: https://claude.ai/code/session_01JjcP4xCcm7Up9wE3QBRZN1
</commit_message>
<xml_diff>
--- a/Robert_Heideman_CV_Bicycle_Technician.docx
+++ b/Robert_Heideman_CV_Bicycle_Technician.docx
@@ -1041,7 +1041,7 @@
               <w:rPr>
                 <w:b/>
               </w:rPr>
-              <w:t>Aiden McDade</w:t>
+              <w:t>Clare Holdsworth</w:t>
             </w:r>
           </w:p>
           <w:p>
@@ -1049,7 +1049,7 @@
               <w:rPr>
                 <w:sz w:val="20"/>
               </w:rPr>
-              <w:t>Director and Senior Physiotherapist, Amend Rehab Pty Ltd</w:t>
+              <w:t>WOR Cycle Tours (Wide Open Road Cycling)</w:t>
             </w:r>
           </w:p>
           <w:p>
@@ -1057,7 +1057,7 @@
               <w:rPr>
                 <w:sz w:val="20"/>
               </w:rPr>
-              <w:t>0449 734 114  •  Aiden@amendrehab.com.au</w:t>
+              <w:t>wideopenroadcycletours@gmail.com</w:t>
             </w:r>
           </w:p>
         </w:tc>

</xml_diff>

<commit_message>
Add Roam Orthotics (Oct 2026 - present)
Co-Authored-By: Claude Opus 5.5 <noreply@anthropic.com>
Claude-Session: https://claude.ai/code/session_01JjcP4xCcm7Up9wE3QBRZN1
</commit_message>
<xml_diff>
--- a/Robert_Heideman_CV_Bicycle_Technician.docx
+++ b/Robert_Heideman_CV_Bicycle_Technician.docx
@@ -504,6 +504,42 @@
           <w:i/>
         </w:rPr>
         <w:t>Ten years as a Prosthetist-Orthotist and technician in Australia, Sweden and Norway, building custom devices by hand.</w:t>
+      </w:r>
+    </w:p>
+    <w:p>
+      <w:pPr>
+        <w:keepNext/>
+        <w:tabs>
+          <w:tab w:pos="9751" w:val="right"/>
+        </w:tabs>
+        <w:spacing w:before="100" w:after="0"/>
+      </w:pPr>
+      <w:r>
+        <w:rPr>
+          <w:b/>
+        </w:rPr>
+        <w:t>Orthotist</w:t>
+      </w:r>
+      <w:r>
+        <w:rPr>
+          <w:color w:val="555555"/>
+          <w:sz w:val="20"/>
+        </w:rPr>
+        <w:tab/>
+        <w:t>Oct 2026 – Present</w:t>
+      </w:r>
+    </w:p>
+    <w:p>
+      <w:pPr>
+        <w:keepNext w:val="0"/>
+        <w:spacing w:after="40"/>
+      </w:pPr>
+      <w:r>
+        <w:rPr>
+          <w:i/>
+          <w:color w:val="555555"/>
+        </w:rPr>
+        <w:t>Roam Orthotics</w:t>
       </w:r>
     </w:p>
     <w:p>

</xml_diff>

<commit_message>
Rewrite CV profile with personal cycling story; add adaptive bikes and tour locations
Co-Authored-By: Claude Opus 5.5 <noreply@anthropic.com>
Claude-Session: https://claude.ai/code/session_01JjcP4xCcm7Up9wE3QBRZN1
</commit_message>
<xml_diff>
--- a/Robert_Heideman_CV_Bicycle_Technician.docx
+++ b/Robert_Heideman_CV_Bicycle_Technician.docx
@@ -65,7 +65,7 @@
         <w:rPr>
           <w:i w:val="0"/>
         </w:rPr>
-        <w:t>I've been fixing bikes since 2009, when I started as a mechanic at The Ride Cycles in Kew, and I've never really stopped. Since 2016 I've travelled each year as a tour mechanic with Wide Open Road Cycling, and in 2020 I founded Heiden Cycle Works, where I design and build my own carbon frames and look after bikes of every kind. Alongside the bikes, I've spent ten years as a Prosthetist-Orthotist, a career built on making things by hand, running workshops, mentoring junior technicians and explaining technical ideas in a way people can understand. What I enjoy most is passing on what I know, and I'd love to bring that to PUSH!, helping young people build their own bikes and the confidence that comes with it.</w:t>
+        <w:t>I've been riding bikes since I was two, and at 14 I landed my first job building bikes at my local bike shop over the summer holidays. I've worked as a mechanic ever since, from the end of high school and all through university. When I started my career as a Prosthetist-Orthotist, I kept the bikes going, working on my own and travelling as a tour mechanic with Wide Open Road Cycling in Europe, Japan and Australia. In 2020, during COVID, I started my own bike brand, Heiden Cycle Works, designing and building custom bespoke bikes myself. I've also created and adapted bikes for people with disabilities. What I enjoy most is passing on what I know, and I'd love to bring that to PUSH!, helping young people build their own bikes and the confidence that comes with it.</w:t>
       </w:r>
     </w:p>
     <w:p>
@@ -99,6 +99,22 @@
       </w:r>
       <w:r>
         <w:t xml:space="preserve"> full servicing, diagnosis and repair of road, mountain, hybrid, kids' and e-bikes; complete bike builds from the frame up, including custom frame building; brakes, gears, drivetrains, wheels, hubs and bearings.</w:t>
+      </w:r>
+    </w:p>
+    <w:p>
+      <w:pPr>
+        <w:pStyle w:val="ListBullet"/>
+        <w:spacing w:after="20"/>
+        <w:ind w:left="340"/>
+      </w:pPr>
+      <w:r>
+        <w:rPr>
+          <w:b/>
+        </w:rPr>
+        <w:t>Adaptive bikes:</w:t>
+      </w:r>
+      <w:r>
+        <w:t xml:space="preserve"> creating and adapting bikes for people with disabilities, drawing on my orthotics background.</w:t>
       </w:r>
     </w:p>
     <w:p>
@@ -147,22 +163,6 @@
       </w:r>
       <w:r>
         <w:t xml:space="preserve"> mentoring junior and new technicians, and breaking complex tasks into simple, achievable steps. I'm patient, encouraging and good at building confidence.</w:t>
-      </w:r>
-    </w:p>
-    <w:p>
-      <w:pPr>
-        <w:pStyle w:val="ListBullet"/>
-        <w:spacing w:after="20"/>
-        <w:ind w:left="340"/>
-      </w:pPr>
-      <w:r>
-        <w:rPr>
-          <w:b/>
-        </w:rPr>
-        <w:t>Communication:</w:t>
-      </w:r>
-      <w:r>
-        <w:t xml:space="preserve"> friendly, clear communicator. I've worked with clients and families of all ages, backgrounds and cultures in Australia, Europe and Cambodia.</w:t>
       </w:r>
     </w:p>
     <w:p>
@@ -317,7 +317,7 @@
         <w:ind w:left="340"/>
       </w:pPr>
       <w:r>
-        <w:t>Travel with the group on multi-day cycling tours each year and maintain every bike on the tour.</w:t>
+        <w:t>Travel with multi-day cycling tours in Europe, Japan and Australia each year and maintain every bike on the tour.</w:t>
       </w:r>
     </w:p>
     <w:p>

</xml_diff>

<commit_message>
Add Roam Orthotics responsibilities
Co-Authored-By: Claude Opus 5.5 <noreply@anthropic.com>
Claude-Session: https://claude.ai/code/session_01JjcP4xCcm7Up9wE3QBRZN1
</commit_message>
<xml_diff>
--- a/Robert_Heideman_CV_Bicycle_Technician.docx
+++ b/Robert_Heideman_CV_Bicycle_Technician.docx
@@ -497,17 +497,6 @@
     </w:p>
     <w:p>
       <w:pPr>
-        <w:spacing w:after="60"/>
-      </w:pPr>
-      <w:r>
-        <w:rPr>
-          <w:i/>
-        </w:rPr>
-        <w:t>Ten years as a Prosthetist-Orthotist and technician in Australia, Sweden and Norway, building custom devices by hand.</w:t>
-      </w:r>
-    </w:p>
-    <w:p>
-      <w:pPr>
         <w:keepNext/>
         <w:tabs>
           <w:tab w:pos="9751" w:val="right"/>
@@ -531,7 +520,7 @@
     </w:p>
     <w:p>
       <w:pPr>
-        <w:keepNext w:val="0"/>
+        <w:keepNext/>
         <w:spacing w:after="40"/>
       </w:pPr>
       <w:r>
@@ -540,6 +529,46 @@
           <w:color w:val="555555"/>
         </w:rPr>
         <w:t>Roam Orthotics</w:t>
+      </w:r>
+    </w:p>
+    <w:p>
+      <w:pPr>
+        <w:pStyle w:val="ListBullet"/>
+        <w:spacing w:after="20"/>
+        <w:ind w:left="340"/>
+      </w:pPr>
+      <w:r>
+        <w:t>See participants for assessment, goal setting and treatment planning, liaising with carers and allied health.</w:t>
+      </w:r>
+    </w:p>
+    <w:p>
+      <w:pPr>
+        <w:pStyle w:val="ListBullet"/>
+        <w:spacing w:after="20"/>
+        <w:ind w:left="340"/>
+      </w:pPr>
+      <w:r>
+        <w:t>Scan, model and create custom orthoses using CAD, 3D printing and traditional hand fabrication.</w:t>
+      </w:r>
+    </w:p>
+    <w:p>
+      <w:pPr>
+        <w:pStyle w:val="ListBullet"/>
+        <w:spacing w:after="20"/>
+        <w:ind w:left="340"/>
+      </w:pPr>
+      <w:r>
+        <w:t>Fit and implement devices, train participants and carers in their use, and provide reviews and adjustments.</w:t>
+      </w:r>
+    </w:p>
+    <w:p>
+      <w:pPr>
+        <w:pStyle w:val="ListBullet"/>
+        <w:spacing w:after="20"/>
+        <w:ind w:left="340"/>
+      </w:pPr>
+      <w:r>
+        <w:t>Run the whole practice: referrals, bookings, NDIS and funding reports, quotes and accounts.</w:t>
       </w:r>
     </w:p>
     <w:p>
@@ -567,7 +596,7 @@
     </w:p>
     <w:p>
       <w:pPr>
-        <w:keepNext/>
+        <w:keepNext w:val="0"/>
         <w:spacing w:after="40"/>
       </w:pPr>
       <w:r>
@@ -576,16 +605,6 @@
           <w:color w:val="555555"/>
         </w:rPr>
         <w:t>Ability Made</w:t>
-      </w:r>
-    </w:p>
-    <w:p>
-      <w:pPr>
-        <w:pStyle w:val="ListBullet"/>
-        <w:spacing w:after="20"/>
-        <w:ind w:left="340"/>
-      </w:pPr>
-      <w:r>
-        <w:t>Senior orthotic role delivering custom orthoses made with digital scanning and design.</w:t>
       </w:r>
     </w:p>
     <w:p>

</xml_diff>

<commit_message>
Add Ability Made responsibilities; note part-time availability in cover letter
Co-Authored-By: Claude Opus 5.5 <noreply@anthropic.com>
Claude-Session: https://claude.ai/code/session_01JjcP4xCcm7Up9wE3QBRZN1
</commit_message>
<xml_diff>
--- a/Robert_Heideman_CV_Bicycle_Technician.docx
+++ b/Robert_Heideman_CV_Bicycle_Technician.docx
@@ -596,7 +596,7 @@
     </w:p>
     <w:p>
       <w:pPr>
-        <w:keepNext w:val="0"/>
+        <w:keepNext/>
         <w:spacing w:after="40"/>
       </w:pPr>
       <w:r>
@@ -605,6 +605,26 @@
           <w:color w:val="555555"/>
         </w:rPr>
         <w:t>Ability Made</w:t>
+      </w:r>
+    </w:p>
+    <w:p>
+      <w:pPr>
+        <w:pStyle w:val="ListBullet"/>
+        <w:spacing w:after="20"/>
+        <w:ind w:left="340"/>
+      </w:pPr>
+      <w:r>
+        <w:t>Helped young people with disabilities achieve their goals and greater independence through custom orthotic care.</w:t>
+      </w:r>
+    </w:p>
+    <w:p>
+      <w:pPr>
+        <w:pStyle w:val="ListBullet"/>
+        <w:spacing w:after="20"/>
+        <w:ind w:left="340"/>
+      </w:pPr>
+      <w:r>
+        <w:t>Held senior responsibilities, including mentoring and supporting other clinicians.</w:t>
       </w:r>
     </w:p>
     <w:p>
@@ -919,7 +939,7 @@
         <w:t>Professional development:</w:t>
       </w:r>
       <w:r>
-        <w:t xml:space="preserve"> founding member of the Digital Limb Collective; participant at the 2016 ISPO European Congress.</w:t>
+        <w:t xml:space="preserve"> founding member, Digital Limb Collective; 2016 ISPO European Congress.</w:t>
       </w:r>
     </w:p>
     <w:p>
@@ -946,7 +966,7 @@
         <w:ind w:left="340"/>
       </w:pPr>
       <w:r>
-        <w:t>Veterans International Cambodia, Phnom Penh (2015): volunteered building and fitting low-cost prostheses with limited resources.</w:t>
+        <w:t>Veterans International Cambodia, Phnom Penh (2015): built and fitted low-cost prostheses with limited resources.</w:t>
       </w:r>
     </w:p>
     <w:p>

</xml_diff>

<commit_message>
Align CV and cover letter with full PUSH! job description
Co-Authored-By: Claude Opus 5.5 <noreply@anthropic.com>
Claude-Session: https://claude.ai/code/session_01JjcP4xCcm7Up9wE3QBRZN1
</commit_message>
<xml_diff>
--- a/Robert_Heideman_CV_Bicycle_Technician.docx
+++ b/Robert_Heideman_CV_Bicycle_Technician.docx
@@ -98,7 +98,7 @@
         <w:t>Bicycle mechanics:</w:t>
       </w:r>
       <w:r>
-        <w:t xml:space="preserve"> full servicing, diagnosis and repair of road, mountain, hybrid, kids' and e-bikes; complete bike builds from the frame up, including custom frame building; brakes, gears, drivetrains, wheels, hubs and bearings.</w:t>
+        <w:t xml:space="preserve"> full servicing, diagnosis and repair of road, mountain, hybrid, kids' and e-bikes; complete builds from the frame up; wheel truing, brake and gear adjustment, drivetrain servicing, cable replacement, hubs and bearings.</w:t>
       </w:r>
     </w:p>
     <w:p>
@@ -146,7 +146,7 @@
         <w:t>Workshop management:</w:t>
       </w:r>
       <w:r>
-        <w:t xml:space="preserve"> running workshops, including tool and equipment upkeep, parts inventory and ordering, workflow and workplace safety.</w:t>
+        <w:t xml:space="preserve"> running fixed and mobile workshops on my own, including tool and equipment upkeep, parts and stock, and WHS practices such as risk assessments and equipment checks.</w:t>
       </w:r>
     </w:p>
     <w:p>

</xml_diff>